<commit_message>
refactor: rename application from CampusSync to CampusEvents across all code, UI, and documentation
</commit_message>
<xml_diff>
--- a/docs/Reflection_Essay.docx
+++ b/docs/Reflection_Essay.docx
@@ -280,7 +280,7 @@
           <w:i w:val="0"/>
           <w:sz w:val="22"/>
         </w:rPr>
-        <w:t>Developing CampusSync for the CSE 3206 sessional challenged me to bridge the divide between theoretical software engineering principles and real-world system architecture. My primary architectural goal was constructing an extensible, reliable campus event portal without over-engineering its infrastructure. Choosing a component-driven React frontend coupled with Google Firebase gave me immediate reactivity, but relying on cloud services introduced potential failure points during network-isolated laboratory evaluations. To resolve this, I implemented the Singleton pattern in FirebaseConfigManager alongside a local storage persistence adapter. This foundational decision decoupled the presentation layer from the physical backend, allowing seamless live execution whether connected to cloud Firestore or operating offline.</w:t>
+        <w:t>Developing CampusEvents for the CSE 3206 sessional challenged me to bridge the divide between theoretical software engineering principles and real-world system architecture. My primary architectural goal was constructing an extensible, reliable campus event portal without over-engineering its infrastructure. Choosing a component-driven React frontend coupled with Google Firebase gave me immediate reactivity, but relying on cloud services introduced potential failure points during network-isolated laboratory evaluations. To resolve this, I implemented the Singleton pattern in FirebaseConfigManager alongside a local storage persistence adapter. This foundational decision decoupled the presentation layer from the physical backend, allowing seamless live execution whether connected to cloud Firestore or operating offline.</w:t>
       </w:r>
     </w:p>
     <w:p>
@@ -387,7 +387,7 @@
           <w:i w:val="0"/>
           <w:sz w:val="22"/>
         </w:rPr>
-        <w:t>Reflecting on the lessons gleaned from CampusSync, the clear next frontier in my software engineering development is mastering Continuous Integration and Continuous Deployment (CI/CD) pipelines using GitHub Actions, integrated with automated End-to-End (E2E) testing via Playwright. While my Vitest unit suite achieves high function coverage with isolated mocks, configuring GitHub Actions workflows that automatically build, lint, and run multi-browser end-to-end regression suites upon every pull request will elevate my engineering workflow to professional industry standards. Mastering containerized deployments with Docker and cloud automated delivery constitutes my immediate technical roadmap for the upcoming academic semester.</w:t>
+        <w:t>Reflecting on the lessons gleaned from CampusEvents, the clear next frontier in my software engineering development is mastering Continuous Integration and Continuous Deployment (CI/CD) pipelines using GitHub Actions, integrated with automated End-to-End (E2E) testing via Playwright. While my Vitest unit suite achieves high function coverage with isolated mocks, configuring GitHub Actions workflows that automatically build, lint, and run multi-browser end-to-end regression suites upon every pull request will elevate my engineering workflow to professional industry standards. Mastering containerized deployments with Docker and cloud automated delivery constitutes my immediate technical roadmap for the upcoming academic semester.</w:t>
       </w:r>
     </w:p>
     <w:sectPr>

</xml_diff>